<commit_message>
Make training booklet print-ready
CMYK print files via Ghostscript with neutral greys sent to the black plate,
crop marks in a 10 mm slug, TrimBox/BleedBox set, and only embedded Heebo
fonts (symbols Heebo lacks are now drawn or reworded). Photo placeholders
are hidden until plant photos exist, the draft label is removed, and a
spec sheet for the print shop sits next to the files.

Co-Authored-By: Claude Opus 5.5 <noreply@anthropic.com>
Claude-Session: https://claude.ai/code/session_017QwGKYwn9UaxXw5WK9ZXBz
</commit_message>
<xml_diff>
--- a/training-booklet/out/חוברת-הדרכה-עובדים-חדשים.docx
+++ b/training-booklet/out/חוברת-הדרכה-עובדים-חדשים.docx
@@ -1201,95 +1201,6 @@
         <w:t xml:space="preserve"/>
       </w:r>
     </w:p>
-    <w:tbl>
-      <w:tblPr>
-        <w:bidiVisual/>
-        <w:tblW w:type="dxa" w:w="7938"/>
-        <w:tblBorders>
-          <w:top w:val="single" w:color="auto" w:sz="4"/>
-          <w:left w:val="single" w:color="auto" w:sz="4"/>
-          <w:bottom w:val="single" w:color="auto" w:sz="4"/>
-          <w:right w:val="single" w:color="auto" w:sz="4"/>
-          <w:insideH w:val="single" w:color="auto" w:sz="4"/>
-          <w:insideV w:val="single" w:color="auto" w:sz="4"/>
-        </w:tblBorders>
-      </w:tblPr>
-      <w:tblGrid>
-        <w:gridCol w:w="7938"/>
-      </w:tblGrid>
-      <w:tr>
-        <w:trPr>
-          <w:cantSplit/>
-        </w:trPr>
-        <w:tc>
-          <w:tcPr>
-            <w:tcW w:type="dxa" w:w="7938"/>
-            <w:tcBorders>
-              <w:top w:val="none" w:color="FFFFFF" w:sz="0"/>
-              <w:left w:val="none" w:color="FFFFFF" w:sz="0"/>
-              <w:bottom w:val="none" w:color="FFFFFF" w:sz="0"/>
-              <w:right w:val="single" w:color="9AA5B1" w:sz="24"/>
-            </w:tcBorders>
-            <w:shd w:fill="F6F7F9" w:color="auto" w:val="clear"/>
-            <w:tcMar>
-              <w:top w:type="dxa" w:w="100"/>
-              <w:left w:type="dxa" w:w="160"/>
-              <w:bottom w:type="dxa" w:w="100"/>
-              <w:right w:type="dxa" w:w="160"/>
-            </w:tcMar>
-          </w:tcPr>
-          <w:p>
-            <w:pPr>
-              <w:bidi/>
-              <w:spacing w:after="100" w:before="500" w:line="300"/>
-            </w:pPr>
-            <w:r>
-              <w:rPr>
-                <w:rFonts w:ascii="Arial" w:cs="Arial" w:eastAsia="Arial" w:hAnsi="Arial"/>
-                <w:b/>
-                <w:bCs/>
-                <w:color w:val="6B7785"/>
-                <w:sz w:val="20"/>
-                <w:szCs w:val="20"/>
-                <w:rtl/>
-              </w:rPr>
-              <w:t xml:space="preserve">📷  מקום לתמונה מהמפעל</w:t>
-            </w:r>
-          </w:p>
-          <w:p>
-            <w:pPr>
-              <w:bidi/>
-              <w:spacing w:after="500" w:before="50" w:line="300"/>
-            </w:pPr>
-            <w:r>
-              <w:rPr>
-                <w:rFonts w:ascii="Arial" w:cs="Arial" w:eastAsia="Arial" w:hAnsi="Arial"/>
-                <w:color w:val="6B7785"/>
-                <w:sz w:val="20"/>
-                <w:szCs w:val="20"/>
-                <w:rtl/>
-              </w:rPr>
-              <w:t xml:space="preserve">תמונה קבוצתית של צוות המפעל, או תמונה מבחוץ של המפעל</w:t>
-            </w:r>
-          </w:p>
-        </w:tc>
-      </w:tr>
-    </w:tbl>
-    <w:p>
-      <w:pPr>
-        <w:bidi/>
-        <w:spacing w:after="50" w:before="0" w:line="300"/>
-      </w:pPr>
-      <w:r>
-        <w:rPr>
-          <w:rFonts w:ascii="Arial" w:cs="Arial" w:eastAsia="Arial" w:hAnsi="Arial"/>
-          <w:sz w:val="20"/>
-          <w:szCs w:val="20"/>
-          <w:rtl/>
-        </w:rPr>
-        <w:t xml:space="preserve"/>
-      </w:r>
-    </w:p>
     <w:p>
       <w:pPr>
         <w:pStyle w:val="Heading1"/>
@@ -3371,95 +3282,6 @@
         <w:t xml:space="preserve">מפעל בטון הוא בעצם מטבח גדול ומדויק מאוד. כל חומר נשקל בנפרד במשקל ממוחשב: החצץ והחול מהתאים, הצמנט מהסילו, המים והמוספים מהמכלים. כל החומרים נכנסים יחד למערבל הגדול, מתערבבים כדקה, ונשפכים למשאית המערבל ("מיקסר"). את כל זה מפעיל הבקר מחדר הבקרה.</w:t>
       </w:r>
     </w:p>
-    <w:tbl>
-      <w:tblPr>
-        <w:bidiVisual/>
-        <w:tblW w:type="dxa" w:w="7938"/>
-        <w:tblBorders>
-          <w:top w:val="single" w:color="auto" w:sz="4"/>
-          <w:left w:val="single" w:color="auto" w:sz="4"/>
-          <w:bottom w:val="single" w:color="auto" w:sz="4"/>
-          <w:right w:val="single" w:color="auto" w:sz="4"/>
-          <w:insideH w:val="single" w:color="auto" w:sz="4"/>
-          <w:insideV w:val="single" w:color="auto" w:sz="4"/>
-        </w:tblBorders>
-      </w:tblPr>
-      <w:tblGrid>
-        <w:gridCol w:w="7938"/>
-      </w:tblGrid>
-      <w:tr>
-        <w:trPr>
-          <w:cantSplit/>
-        </w:trPr>
-        <w:tc>
-          <w:tcPr>
-            <w:tcW w:type="dxa" w:w="7938"/>
-            <w:tcBorders>
-              <w:top w:val="none" w:color="FFFFFF" w:sz="0"/>
-              <w:left w:val="none" w:color="FFFFFF" w:sz="0"/>
-              <w:bottom w:val="none" w:color="FFFFFF" w:sz="0"/>
-              <w:right w:val="single" w:color="9AA5B1" w:sz="24"/>
-            </w:tcBorders>
-            <w:shd w:fill="F6F7F9" w:color="auto" w:val="clear"/>
-            <w:tcMar>
-              <w:top w:type="dxa" w:w="100"/>
-              <w:left w:type="dxa" w:w="160"/>
-              <w:bottom w:type="dxa" w:w="100"/>
-              <w:right w:type="dxa" w:w="160"/>
-            </w:tcMar>
-          </w:tcPr>
-          <w:p>
-            <w:pPr>
-              <w:bidi/>
-              <w:spacing w:after="100" w:before="500" w:line="300"/>
-            </w:pPr>
-            <w:r>
-              <w:rPr>
-                <w:rFonts w:ascii="Arial" w:cs="Arial" w:eastAsia="Arial" w:hAnsi="Arial"/>
-                <w:b/>
-                <w:bCs/>
-                <w:color w:val="6B7785"/>
-                <w:sz w:val="20"/>
-                <w:szCs w:val="20"/>
-                <w:rtl/>
-              </w:rPr>
-              <w:t xml:space="preserve">📷  מקום לתמונה מהמפעל</w:t>
-            </w:r>
-          </w:p>
-          <w:p>
-            <w:pPr>
-              <w:bidi/>
-              <w:spacing w:after="500" w:before="50" w:line="300"/>
-            </w:pPr>
-            <w:r>
-              <w:rPr>
-                <w:rFonts w:ascii="Arial" w:cs="Arial" w:eastAsia="Arial" w:hAnsi="Arial"/>
-                <w:color w:val="6B7785"/>
-                <w:sz w:val="20"/>
-                <w:szCs w:val="20"/>
-                <w:rtl/>
-              </w:rPr>
-              <w:t xml:space="preserve">חדר הבקרה ומסך מחשב הערבול במפעל</w:t>
-            </w:r>
-          </w:p>
-        </w:tc>
-      </w:tr>
-    </w:tbl>
-    <w:p>
-      <w:pPr>
-        <w:bidi/>
-        <w:spacing w:after="50" w:before="0" w:line="300"/>
-      </w:pPr>
-      <w:r>
-        <w:rPr>
-          <w:rFonts w:ascii="Arial" w:cs="Arial" w:eastAsia="Arial" w:hAnsi="Arial"/>
-          <w:sz w:val="20"/>
-          <w:szCs w:val="20"/>
-          <w:rtl/>
-        </w:rPr>
-        <w:t xml:space="preserve"/>
-      </w:r>
-    </w:p>
     <w:p>
       <w:pPr>
         <w:pStyle w:val="Heading2"/>
@@ -5690,95 +5512,6 @@
         <w:t xml:space="preserve"/>
       </w:r>
     </w:p>
-    <w:tbl>
-      <w:tblPr>
-        <w:bidiVisual/>
-        <w:tblW w:type="dxa" w:w="7938"/>
-        <w:tblBorders>
-          <w:top w:val="single" w:color="auto" w:sz="4"/>
-          <w:left w:val="single" w:color="auto" w:sz="4"/>
-          <w:bottom w:val="single" w:color="auto" w:sz="4"/>
-          <w:right w:val="single" w:color="auto" w:sz="4"/>
-          <w:insideH w:val="single" w:color="auto" w:sz="4"/>
-          <w:insideV w:val="single" w:color="auto" w:sz="4"/>
-        </w:tblBorders>
-      </w:tblPr>
-      <w:tblGrid>
-        <w:gridCol w:w="7938"/>
-      </w:tblGrid>
-      <w:tr>
-        <w:trPr>
-          <w:cantSplit/>
-        </w:trPr>
-        <w:tc>
-          <w:tcPr>
-            <w:tcW w:type="dxa" w:w="7938"/>
-            <w:tcBorders>
-              <w:top w:val="none" w:color="FFFFFF" w:sz="0"/>
-              <w:left w:val="none" w:color="FFFFFF" w:sz="0"/>
-              <w:bottom w:val="none" w:color="FFFFFF" w:sz="0"/>
-              <w:right w:val="single" w:color="9AA5B1" w:sz="24"/>
-            </w:tcBorders>
-            <w:shd w:fill="F6F7F9" w:color="auto" w:val="clear"/>
-            <w:tcMar>
-              <w:top w:type="dxa" w:w="100"/>
-              <w:left w:type="dxa" w:w="160"/>
-              <w:bottom w:type="dxa" w:w="100"/>
-              <w:right w:type="dxa" w:w="160"/>
-            </w:tcMar>
-          </w:tcPr>
-          <w:p>
-            <w:pPr>
-              <w:bidi/>
-              <w:spacing w:after="100" w:before="500" w:line="300"/>
-            </w:pPr>
-            <w:r>
-              <w:rPr>
-                <w:rFonts w:ascii="Arial" w:cs="Arial" w:eastAsia="Arial" w:hAnsi="Arial"/>
-                <w:b/>
-                <w:bCs/>
-                <w:color w:val="6B7785"/>
-                <w:sz w:val="20"/>
-                <w:szCs w:val="20"/>
-                <w:rtl/>
-              </w:rPr>
-              <w:t xml:space="preserve">📷  מקום לתמונה מהמפעל</w:t>
-            </w:r>
-          </w:p>
-          <w:p>
-            <w:pPr>
-              <w:bidi/>
-              <w:spacing w:after="500" w:before="50" w:line="300"/>
-            </w:pPr>
-            <w:r>
-              <w:rPr>
-                <w:rFonts w:ascii="Arial" w:cs="Arial" w:eastAsia="Arial" w:hAnsi="Arial"/>
-                <w:color w:val="6B7785"/>
-                <w:sz w:val="20"/>
-                <w:szCs w:val="20"/>
-                <w:rtl/>
-              </w:rPr>
-              <w:t xml:space="preserve">הנפות במגרסה, ודוגמה לרשת תקינה לעומת רשת קרועה</w:t>
-            </w:r>
-          </w:p>
-        </w:tc>
-      </w:tr>
-    </w:tbl>
-    <w:p>
-      <w:pPr>
-        <w:bidi/>
-        <w:spacing w:after="50" w:before="0" w:line="300"/>
-      </w:pPr>
-      <w:r>
-        <w:rPr>
-          <w:rFonts w:ascii="Arial" w:cs="Arial" w:eastAsia="Arial" w:hAnsi="Arial"/>
-          <w:sz w:val="20"/>
-          <w:szCs w:val="20"/>
-          <w:rtl/>
-        </w:rPr>
-        <w:t xml:space="preserve"/>
-      </w:r>
-    </w:p>
     <w:p>
       <w:pPr>
         <w:pStyle w:val="Heading2"/>
@@ -10759,95 +10492,6 @@
         <w:t xml:space="preserve"/>
       </w:r>
     </w:p>
-    <w:tbl>
-      <w:tblPr>
-        <w:bidiVisual/>
-        <w:tblW w:type="dxa" w:w="7938"/>
-        <w:tblBorders>
-          <w:top w:val="single" w:color="auto" w:sz="4"/>
-          <w:left w:val="single" w:color="auto" w:sz="4"/>
-          <w:bottom w:val="single" w:color="auto" w:sz="4"/>
-          <w:right w:val="single" w:color="auto" w:sz="4"/>
-          <w:insideH w:val="single" w:color="auto" w:sz="4"/>
-          <w:insideV w:val="single" w:color="auto" w:sz="4"/>
-        </w:tblBorders>
-      </w:tblPr>
-      <w:tblGrid>
-        <w:gridCol w:w="7938"/>
-      </w:tblGrid>
-      <w:tr>
-        <w:trPr>
-          <w:cantSplit/>
-        </w:trPr>
-        <w:tc>
-          <w:tcPr>
-            <w:tcW w:type="dxa" w:w="7938"/>
-            <w:tcBorders>
-              <w:top w:val="none" w:color="FFFFFF" w:sz="0"/>
-              <w:left w:val="none" w:color="FFFFFF" w:sz="0"/>
-              <w:bottom w:val="none" w:color="FFFFFF" w:sz="0"/>
-              <w:right w:val="single" w:color="9AA5B1" w:sz="24"/>
-            </w:tcBorders>
-            <w:shd w:fill="F6F7F9" w:color="auto" w:val="clear"/>
-            <w:tcMar>
-              <w:top w:type="dxa" w:w="100"/>
-              <w:left w:type="dxa" w:w="160"/>
-              <w:bottom w:type="dxa" w:w="100"/>
-              <w:right w:type="dxa" w:w="160"/>
-            </w:tcMar>
-          </w:tcPr>
-          <w:p>
-            <w:pPr>
-              <w:bidi/>
-              <w:spacing w:after="100" w:before="500" w:line="300"/>
-            </w:pPr>
-            <w:r>
-              <w:rPr>
-                <w:rFonts w:ascii="Arial" w:cs="Arial" w:eastAsia="Arial" w:hAnsi="Arial"/>
-                <w:b/>
-                <w:bCs/>
-                <w:color w:val="6B7785"/>
-                <w:sz w:val="20"/>
-                <w:szCs w:val="20"/>
-                <w:rtl/>
-              </w:rPr>
-              <w:t xml:space="preserve">📷  מקום לתמונה מהמפעל</w:t>
-            </w:r>
-          </w:p>
-          <w:p>
-            <w:pPr>
-              <w:bidi/>
-              <w:spacing w:after="500" w:before="50" w:line="300"/>
-            </w:pPr>
-            <w:r>
-              <w:rPr>
-                <w:rFonts w:ascii="Arial" w:cs="Arial" w:eastAsia="Arial" w:hAnsi="Arial"/>
-                <w:color w:val="6B7785"/>
-                <w:sz w:val="20"/>
-                <w:szCs w:val="20"/>
-                <w:rtl/>
-              </w:rPr>
-              <w:t xml:space="preserve">השלטים על הסילואים במפעל, ועמדת חיבור הצנרת</w:t>
-            </w:r>
-          </w:p>
-        </w:tc>
-      </w:tr>
-    </w:tbl>
-    <w:p>
-      <w:pPr>
-        <w:bidi/>
-        <w:spacing w:after="50" w:before="0" w:line="300"/>
-      </w:pPr>
-      <w:r>
-        <w:rPr>
-          <w:rFonts w:ascii="Arial" w:cs="Arial" w:eastAsia="Arial" w:hAnsi="Arial"/>
-          <w:sz w:val="20"/>
-          <w:szCs w:val="20"/>
-          <w:rtl/>
-        </w:rPr>
-        <w:t xml:space="preserve"/>
-      </w:r>
-    </w:p>
     <w:p>
       <w:pPr>
         <w:pStyle w:val="Heading2"/>
@@ -17958,95 +17602,6 @@
           <w:rtl/>
         </w:rPr>
         <w:t xml:space="preserve">חרסית, אבנים גדולות או צבע שונה: לא מזינים, ומודיעים לבקר.</w:t>
-      </w:r>
-    </w:p>
-    <w:tbl>
-      <w:tblPr>
-        <w:bidiVisual/>
-        <w:tblW w:type="dxa" w:w="7938"/>
-        <w:tblBorders>
-          <w:top w:val="single" w:color="auto" w:sz="4"/>
-          <w:left w:val="single" w:color="auto" w:sz="4"/>
-          <w:bottom w:val="single" w:color="auto" w:sz="4"/>
-          <w:right w:val="single" w:color="auto" w:sz="4"/>
-          <w:insideH w:val="single" w:color="auto" w:sz="4"/>
-          <w:insideV w:val="single" w:color="auto" w:sz="4"/>
-        </w:tblBorders>
-      </w:tblPr>
-      <w:tblGrid>
-        <w:gridCol w:w="7938"/>
-      </w:tblGrid>
-      <w:tr>
-        <w:trPr>
-          <w:cantSplit/>
-        </w:trPr>
-        <w:tc>
-          <w:tcPr>
-            <w:tcW w:type="dxa" w:w="7938"/>
-            <w:tcBorders>
-              <w:top w:val="none" w:color="FFFFFF" w:sz="0"/>
-              <w:left w:val="none" w:color="FFFFFF" w:sz="0"/>
-              <w:bottom w:val="none" w:color="FFFFFF" w:sz="0"/>
-              <w:right w:val="single" w:color="9AA5B1" w:sz="24"/>
-            </w:tcBorders>
-            <w:shd w:fill="F6F7F9" w:color="auto" w:val="clear"/>
-            <w:tcMar>
-              <w:top w:type="dxa" w:w="100"/>
-              <w:left w:type="dxa" w:w="160"/>
-              <w:bottom w:type="dxa" w:w="100"/>
-              <w:right w:type="dxa" w:w="160"/>
-            </w:tcMar>
-          </w:tcPr>
-          <w:p>
-            <w:pPr>
-              <w:bidi/>
-              <w:spacing w:after="100" w:before="500" w:line="300"/>
-            </w:pPr>
-            <w:r>
-              <w:rPr>
-                <w:rFonts w:ascii="Arial" w:cs="Arial" w:eastAsia="Arial" w:hAnsi="Arial"/>
-                <w:b/>
-                <w:bCs/>
-                <w:color w:val="6B7785"/>
-                <w:sz w:val="20"/>
-                <w:szCs w:val="20"/>
-                <w:rtl/>
-              </w:rPr>
-              <w:t xml:space="preserve">📷  מקום לתמונה מהמפעל</w:t>
-            </w:r>
-          </w:p>
-          <w:p>
-            <w:pPr>
-              <w:bidi/>
-              <w:spacing w:after="500" w:before="50" w:line="300"/>
-            </w:pPr>
-            <w:r>
-              <w:rPr>
-                <w:rFonts w:ascii="Arial" w:cs="Arial" w:eastAsia="Arial" w:hAnsi="Arial"/>
-                <w:color w:val="6B7785"/>
-                <w:sz w:val="20"/>
-                <w:szCs w:val="20"/>
-                <w:rtl/>
-              </w:rPr>
-              <w:t xml:space="preserve">התאים במפעל עם שלטי המוצרים, כפי שהם נראים מהשופל</w:t>
-            </w:r>
-          </w:p>
-        </w:tc>
-      </w:tr>
-    </w:tbl>
-    <w:p>
-      <w:pPr>
-        <w:bidi/>
-        <w:spacing w:after="50" w:before="0" w:line="300"/>
-      </w:pPr>
-      <w:r>
-        <w:rPr>
-          <w:rFonts w:ascii="Arial" w:cs="Arial" w:eastAsia="Arial" w:hAnsi="Arial"/>
-          <w:sz w:val="20"/>
-          <w:szCs w:val="20"/>
-          <w:rtl/>
-        </w:rPr>
-        <w:t xml:space="preserve"/>
       </w:r>
     </w:p>
     <w:p>

</xml_diff>